<commit_message>
web(i18n): publish multilingual app and CV downloads
</commit_message>
<xml_diff>
--- a/public/files/cv/en/cv-ats-henry-bory-prevez-en.docx
+++ b/public/files/cv/en/cv-ats-henry-bory-prevez-en.docx
@@ -6,182 +6,139 @@
       <w:r>
         <w:rPr>
           <w:b/>
-          <w:sz w:val="36"/>
+          <w:color w:val="0C2340"/>
+          <w:sz w:val="40"/>
         </w:rPr>
         <w:t>Henry Bory Prevez</w:t>
       </w:r>
     </w:p>
     <w:p>
       <w:r>
-        <w:t>Full Professor | PhD in Automatic Control | Universidad de Oriente | Santiago de Cuba</w:t>
-      </w:r>
-    </w:p>
-    <w:p>
-      <w:pPr>
-        <w:pStyle w:val="Heading2"/>
-      </w:pPr>
-      <w:r>
-        <w:t>Professional Summary</w:t>
+        <w:t>Full Professor · Doctor of Sciences in Automatic Control</w:t>
       </w:r>
     </w:p>
     <w:p>
       <w:r>
-        <w:t>Full Professor and researcher in Automatic Control, power electronics, renewable energy systems, scientific software and applied mathematical modelling. Experience in university teaching, simulation, control systems, power converters, micro-hydropower, OTEC systems, virtual laboratories and scientific publications.</w:t>
+        <w:rPr>
+          <w:b/>
+        </w:rPr>
+        <w:t>ATS CV</w:t>
       </w:r>
     </w:p>
     <w:p>
-      <w:pPr>
-        <w:pStyle w:val="Heading2"/>
-      </w:pPr>
       <w:r>
-        <w:t>Areas of Expertise</w:t>
+        <w:t>Universidad de Oriente · Santiago de Cuba</w:t>
+      </w:r>
+    </w:p>
+    <w:p>
+      <w:r>
+        <w:t>English · Functional translation for international visibility; review before official institutional use.</w:t>
+      </w:r>
+    </w:p>
+    <w:p>
+      <w:r>
+        <w:rPr>
+          <w:b/>
+          <w:color w:val="123456"/>
+          <w:sz w:val="26"/>
+        </w:rPr>
+        <w:t>Profile</w:t>
+      </w:r>
+    </w:p>
+    <w:p>
+      <w:r>
+        <w:t>Full Professor at Universidad de Oriente with work in automatic control, power electronics, advanced control, renewable energy, micro-hydropower, OTEC, wave energy, scientific software and applied mathematical modelling.</w:t>
+      </w:r>
+    </w:p>
+    <w:p>
+      <w:r>
+        <w:rPr>
+          <w:b/>
+          <w:color w:val="123456"/>
+          <w:sz w:val="26"/>
+        </w:rPr>
+        <w:t>Areas of expertise</w:t>
       </w:r>
     </w:p>
     <w:p>
       <w:pPr>
         <w:pStyle w:val="ListBullet"/>
-        <w:spacing w:after="40"/>
       </w:pPr>
       <w:r>
-        <w:t>Automatic Control</w:t>
+        <w:rPr>
+          <w:sz w:val="20"/>
+        </w:rPr>
+        <w:t>Automatic control, advanced control and power electronics.</w:t>
       </w:r>
     </w:p>
     <w:p>
       <w:pPr>
         <w:pStyle w:val="ListBullet"/>
-        <w:spacing w:after="40"/>
       </w:pPr>
       <w:r>
-        <w:t>Power Electronics</w:t>
+        <w:rPr>
+          <w:sz w:val="20"/>
+        </w:rPr>
+        <w:t>Micro-hydropower, Pelton turbine contexts and isolated microgrids.</w:t>
       </w:r>
     </w:p>
     <w:p>
       <w:pPr>
         <w:pStyle w:val="ListBullet"/>
-        <w:spacing w:after="40"/>
       </w:pPr>
       <w:r>
-        <w:t>Renewable Energy Systems</w:t>
+        <w:rPr>
+          <w:sz w:val="20"/>
+        </w:rPr>
+        <w:t>OTEC systems, ocean energy and wave energy.</w:t>
       </w:r>
     </w:p>
     <w:p>
       <w:pPr>
         <w:pStyle w:val="ListBullet"/>
-        <w:spacing w:after="40"/>
       </w:pPr>
       <w:r>
-        <w:t>Micro-hydropower and Pelton Turbine Systems</w:t>
+        <w:rPr>
+          <w:sz w:val="20"/>
+        </w:rPr>
+        <w:t>MATLAB/Simulink, Python, Octave, Arduino and virtual laboratories.</w:t>
       </w:r>
     </w:p>
     <w:p>
       <w:pPr>
         <w:pStyle w:val="ListBullet"/>
-        <w:spacing w:after="40"/>
       </w:pPr>
       <w:r>
-        <w:t>OTEC and Ocean Energy</w:t>
-      </w:r>
-    </w:p>
-    <w:p>
-      <w:pPr>
-        <w:pStyle w:val="ListBullet"/>
-        <w:spacing w:after="40"/>
-      </w:pPr>
-      <w:r>
-        <w:t>Scientific Software</w:t>
-      </w:r>
-    </w:p>
-    <w:p>
-      <w:pPr>
-        <w:pStyle w:val="ListBullet"/>
-        <w:spacing w:after="40"/>
-      </w:pPr>
-      <w:r>
-        <w:t>MATLAB/Simulink</w:t>
-      </w:r>
-    </w:p>
-    <w:p>
-      <w:pPr>
-        <w:pStyle w:val="ListBullet"/>
-        <w:spacing w:after="40"/>
-      </w:pPr>
-      <w:r>
-        <w:t>Python</w:t>
-      </w:r>
-    </w:p>
-    <w:p>
-      <w:pPr>
-        <w:pStyle w:val="ListBullet"/>
-        <w:spacing w:after="40"/>
-      </w:pPr>
-      <w:r>
-        <w:t>Modelling and Simulation</w:t>
-      </w:r>
-    </w:p>
-    <w:p>
-      <w:pPr>
-        <w:pStyle w:val="ListBullet"/>
-        <w:spacing w:after="40"/>
-      </w:pPr>
-      <w:r>
-        <w:t>Digital Signal Processing</w:t>
-      </w:r>
-    </w:p>
-    <w:p>
-      <w:pPr>
-        <w:pStyle w:val="ListBullet"/>
-        <w:spacing w:after="40"/>
-      </w:pPr>
-      <w:r>
-        <w:t>Computational Biophysics</w:t>
-      </w:r>
-    </w:p>
-    <w:p>
-      <w:pPr>
-        <w:pStyle w:val="Heading2"/>
-      </w:pPr>
-      <w:r>
-        <w:t>Selected Results</w:t>
-      </w:r>
-    </w:p>
-    <w:p>
-      <w:pPr>
-        <w:pStyle w:val="ListBullet"/>
-        <w:spacing w:after="40"/>
-      </w:pPr>
-      <w:r>
-        <w:t>International projects: CRECE and IRIS.</w:t>
-      </w:r>
-    </w:p>
-    <w:p>
-      <w:pPr>
-        <w:pStyle w:val="ListBullet"/>
-        <w:spacing w:after="40"/>
-      </w:pPr>
-      <w:r>
-        <w:t>Software references: Niord, AnaRed, TabPer, Cal_Arr_Fre, Calc_Covid19.</w:t>
-      </w:r>
-    </w:p>
-    <w:p>
-      <w:pPr>
-        <w:pStyle w:val="ListBullet"/>
-        <w:spacing w:after="40"/>
-      </w:pPr>
-      <w:r>
-        <w:t>Publications in energy systems, control, educational software, COVID-19 modelling and computational biophysics.</w:t>
-      </w:r>
-    </w:p>
-    <w:p>
-      <w:pPr>
-        <w:pStyle w:val="Heading2"/>
-      </w:pPr>
-      <w:r>
-        <w:t>Languages</w:t>
+        <w:rPr>
+          <w:sz w:val="20"/>
+        </w:rPr>
+        <w:t>Computational biophysics, mathematical oncology and complex systems modelling.</w:t>
       </w:r>
     </w:p>
     <w:p>
       <w:r>
-        <w:t>Spanish and English. Dutch version of the portfolio is under preparation.</w:t>
+        <w:rPr>
+          <w:b/>
+          <w:color w:val="123456"/>
+          <w:sz w:val="26"/>
+        </w:rPr>
+        <w:t>Keywords</w:t>
+      </w:r>
+    </w:p>
+    <w:p>
+      <w:r>
+        <w:t>Automatic Control · Power Electronics · Renewable Energy · Micro-hydropower · OTEC · MATLAB · Simulink · Python · Scientific Software · Mathematical Modelling</w:t>
+      </w:r>
+    </w:p>
+    <w:p/>
+    <w:p>
+      <w:r>
+        <w:rPr>
+          <w:i/>
+          <w:color w:val="5A5A5A"/>
+          <w:sz w:val="16"/>
+        </w:rPr>
+        <w:t>Functional translation for international visibility; review before official institutional use.</w:t>
       </w:r>
     </w:p>
     <w:sectPr>
@@ -559,7 +516,7 @@
     <w:rsid w:val="00FC693F"/>
     <w:rPr>
       <w:rFonts w:ascii="Arial" w:hAnsi="Arial"/>
-      <w:sz w:val="19"/>
+      <w:sz w:val="20"/>
     </w:rPr>
   </w:style>
   <w:style w:type="paragraph" w:styleId="Header">
@@ -621,11 +578,11 @@
       <w:outlineLvl w:val="0"/>
     </w:pPr>
     <w:rPr>
-      <w:rFonts w:asciiTheme="majorHAnsi" w:eastAsiaTheme="majorEastAsia" w:hAnsiTheme="majorHAnsi" w:cstheme="majorBidi" w:ascii="Arial" w:hAnsi="Arial"/>
+      <w:rFonts w:asciiTheme="majorHAnsi" w:eastAsiaTheme="majorEastAsia" w:hAnsiTheme="majorHAnsi" w:cstheme="majorBidi"/>
       <w:b/>
       <w:bCs/>
       <w:color w:val="365F91" w:themeColor="accent1" w:themeShade="BF"/>
-      <w:sz w:val="36"/>
+      <w:sz w:val="28"/>
       <w:szCs w:val="28"/>
     </w:rPr>
   </w:style>
@@ -645,11 +602,11 @@
       <w:outlineLvl w:val="1"/>
     </w:pPr>
     <w:rPr>
-      <w:rFonts w:asciiTheme="majorHAnsi" w:eastAsiaTheme="majorEastAsia" w:hAnsiTheme="majorHAnsi" w:cstheme="majorBidi" w:ascii="Arial" w:hAnsi="Arial"/>
+      <w:rFonts w:asciiTheme="majorHAnsi" w:eastAsiaTheme="majorEastAsia" w:hAnsiTheme="majorHAnsi" w:cstheme="majorBidi"/>
       <w:b/>
       <w:bCs/>
       <w:color w:val="4F81BD" w:themeColor="accent1"/>
-      <w:sz w:val="24"/>
+      <w:sz w:val="26"/>
       <w:szCs w:val="26"/>
     </w:rPr>
   </w:style>
@@ -669,7 +626,7 @@
       <w:outlineLvl w:val="2"/>
     </w:pPr>
     <w:rPr>
-      <w:rFonts w:asciiTheme="majorHAnsi" w:eastAsiaTheme="majorEastAsia" w:hAnsiTheme="majorHAnsi" w:cstheme="majorBidi" w:ascii="Arial" w:hAnsi="Arial"/>
+      <w:rFonts w:asciiTheme="majorHAnsi" w:eastAsiaTheme="majorEastAsia" w:hAnsiTheme="majorHAnsi" w:cstheme="majorBidi"/>
       <w:b/>
       <w:bCs/>
       <w:color w:val="4F81BD" w:themeColor="accent1"/>

</xml_diff>